<commit_message>
Cập nhật trọn bộ tài liệu Word sau đợt 2–3 và nợ kỹ thuật
- Bản đồ chức năng: 11 vai (thêm thủ kho phụ tùng, tổ sửa chữa, tách KT Chi
  phí), các dòng mới cho thẻ cao tốc, nợ trạm dầu VN, đổi xe giữa đường, lệnh sửa
  chữa riêng, hoá đơn gộp tháng; định khoản ghi theo mã con 1371/4021
- Hướng dẫn thử: 15 thẻ tài khoản, dữ liệu gieo sẵn cho phần mới, thứ tự thử
  gọn (1→9 rồi 9b→9f), bảng phân quyền 16 chỗ phải bị chặn
- Hợp đồng API anh Khang: PC_SC và PXK_PT sinh từ lệnh sửa chữa riêng thì
  trip_no = null, số lệnh nằm trong lines
- Sinh lại toàn bộ 9 tệp Word trong DOCS/word từ nguồn Markdown

Co-Authored-By: Claude Fable 5.1 <noreply@anthropic.com>
</commit_message>
<xml_diff>
--- a/DOCS/word/BAN_DO_CHUC_NANG.docx
+++ b/DOCS/word/BAN_DO_CHUC_NANG.docx
@@ -654,7 +654,25 @@
               <w:t>Hoá đơn vận chuyển</w:t>
             </w:r>
             <w:r>
-              <w:t xml:space="preserve"> (bản in) + nút *Lập hoá đơn* / *Đã thu tiền* của kế toán doanh thu</w:t>
+              <w:t xml:space="preserve"> (bản in) + </w:t>
+            </w:r>
+            <w:r>
+              <w:rPr>
+                <w:b/>
+              </w:rPr>
+              <w:t>sổ thu tiền</w:t>
+            </w:r>
+            <w:r>
+              <w:t xml:space="preserve"> từng lần (tiền nào cũng được, có tỷ giá ngày thu) của kế toán doanh thu; khách hợp đồng thì </w:t>
+            </w:r>
+            <w:r>
+              <w:rPr>
+                <w:b/>
+              </w:rPr>
+              <w:t>hoá đơn gộp tháng</w:t>
+            </w:r>
+            <w:r>
+              <w:t xml:space="preserve"> một tờ nhiều phiếu</w:t>
             </w:r>
           </w:p>
         </w:tc>
@@ -679,7 +697,7 @@
           <w:p>
             <w:r/>
             <w:r>
-              <w:t>Họ không ký POD điện tử; hoá đơn giấy in ra và ký tay</w:t>
+              <w:t>Họ không ký POD điện tử; hoá đơn giấy in ra và ký tay. Anh Khampla C8.2: khách hợp đồng nhận một tờ cuối tháng</w:t>
             </w:r>
           </w:p>
         </w:tc>
@@ -993,7 +1011,16 @@
               <w:t>Mục V của phiếu</w:t>
             </w:r>
             <w:r>
-              <w:t xml:space="preserve"> + báo cáo sửa chữa theo xe (gom từ mục V)</w:t>
+              <w:t xml:space="preserve"> (sửa trong chuyến) + </w:t>
+            </w:r>
+            <w:r>
+              <w:rPr>
+                <w:b/>
+              </w:rPr>
+              <w:t>Lệnh sửa chữa riêng</w:t>
+            </w:r>
+            <w:r>
+              <w:t xml:space="preserve"> (xe nằm bãi đại tu, bảo dưỡng định kỳ — không gắn phiếu) · màn Xe tab Sửa chữa gom cả hai</w:t>
             </w:r>
           </w:p>
         </w:tc>
@@ -1007,7 +1034,7 @@
               <w:rPr>
                 <w:b/>
               </w:rPr>
-              <w:t>Thay</w:t>
+              <w:t>Thay + Mới</w:t>
             </w:r>
           </w:p>
         </w:tc>
@@ -1018,7 +1045,7 @@
           <w:p>
             <w:r/>
             <w:r>
-              <w:t>Quy trình của họ: sửa xe gắn vào số phiếu xuất xe, không có phiếu bảo dưỡng riêng</w:t>
+              <w:t>Anh Khampla C7.3 xác nhận có bảo dưỡng định kỳ; lệnh riêng đi đúng chuỗi duyệt của mục V</w:t>
             </w:r>
           </w:p>
         </w:tc>
@@ -1311,7 +1338,25 @@
               <w:t>Xe liên kết</w:t>
             </w:r>
             <w:r>
-              <w:t xml:space="preserve"> — báo cáo riêng + bảng thanh toán chủ xe trên phiếu</w:t>
+              <w:t xml:space="preserve"> — báo cáo riêng + danh mục </w:t>
+            </w:r>
+            <w:r>
+              <w:rPr>
+                <w:b/>
+              </w:rPr>
+              <w:t>chủ xe</w:t>
+            </w:r>
+            <w:r>
+              <w:t xml:space="preserve"> (phí %, ngưỡng tấn, cách trả riêng từng chủ) + quỹ </w:t>
+            </w:r>
+            <w:r>
+              <w:rPr>
+                <w:b/>
+              </w:rPr>
+              <w:t>trả gộp</w:t>
+            </w:r>
+            <w:r>
+              <w:t xml:space="preserve"> nhiều phiếu một đợt</w:t>
             </w:r>
           </w:p>
         </w:tc>
@@ -1336,7 +1381,7 @@
           <w:p>
             <w:r/>
             <w:r>
-              <w:t>Trọng tâm mô hình môi giới của họ</w:t>
+              <w:t>Trọng tâm mô hình môi giới của họ; anh Khampla C4.2 · C4.3</w:t>
             </w:r>
           </w:p>
         </w:tc>
@@ -1349,7 +1394,7 @@
           <w:p>
             <w:r/>
             <w:r>
-              <w:t>Tiền chuyến tài xế (chưa có)</w:t>
+              <w:t>Thẻ cao tốc (chưa có)</w:t>
             </w:r>
           </w:p>
         </w:tc>
@@ -1363,10 +1408,10 @@
               <w:rPr>
                 <w:b/>
               </w:rPr>
-              <w:t>Tiền chuyến &amp; tiền nước tài xế</w:t>
-            </w:r>
-            <w:r>
-              <w:t xml:space="preserve"> — gom từ mục IV theo tháng</w:t>
+              <w:t>Thẻ cao tốc</w:t>
+            </w:r>
+            <w:r>
+              <w:t xml:space="preserve"> — số dư từng thẻ, nạp tiền, trừ khi ghi sổ mục IV, cấn trừ cước cuối tháng cho thẻ khách cấp</w:t>
             </w:r>
           </w:p>
         </w:tc>
@@ -1391,7 +1436,7 @@
           <w:p>
             <w:r/>
             <w:r>
-              <w:t>Sheet báo cáo số 5 của họ</w:t>
+              <w:t>Anh Khampla C6.1</w:t>
             </w:r>
           </w:p>
         </w:tc>
@@ -1404,7 +1449,7 @@
           <w:p>
             <w:r/>
             <w:r>
-              <w:t>Công nợ nhà cung cấp (chưa có)</w:t>
+              <w:t>Nợ trạm dầu Việt Nam (chưa có)</w:t>
             </w:r>
           </w:p>
         </w:tc>
@@ -1415,13 +1460,25 @@
           <w:p>
             <w:r/>
             <w:r>
+              <w:t xml:space="preserve">Ô </w:t>
+            </w:r>
+            <w:r>
               <w:rPr>
                 <w:b/>
               </w:rPr>
-              <w:t>Theo dõi nhà cung cấp</w:t>
-            </w:r>
-            <w:r>
-              <w:t xml:space="preserve"> — phát sinh từ phiếu, đã trả, còn nợ</w:t>
+              <w:t>Ghi nợ tại trạm</w:t>
+            </w:r>
+            <w:r>
+              <w:t xml:space="preserve"> trên dòng dầu mua ngoài · công nợ trạm · bảng </w:t>
+            </w:r>
+            <w:r>
+              <w:rPr>
+                <w:b/>
+              </w:rPr>
+              <w:t>Cấn trừ cuối tháng</w:t>
+            </w:r>
+            <w:r>
+              <w:t xml:space="preserve"> (thẻ + nợ trạm cạnh cước phải thu)</w:t>
             </w:r>
           </w:p>
         </w:tc>
@@ -1446,7 +1503,7 @@
           <w:p>
             <w:r/>
             <w:r>
-              <w:t>Sheet báo cáo số 6</w:t>
+              <w:t>Anh Khampla C5.1</w:t>
             </w:r>
           </w:p>
         </w:tc>
@@ -1459,7 +1516,7 @@
           <w:p>
             <w:r/>
             <w:r>
-              <w:t>Kho nhiên liệu (chưa có)</w:t>
+              <w:t>Đổi xe giữa đường (chưa có)</w:t>
             </w:r>
           </w:p>
         </w:tc>
@@ -1470,13 +1527,16 @@
           <w:p>
             <w:r/>
             <w:r>
+              <w:t xml:space="preserve">Nút </w:t>
+            </w:r>
+            <w:r>
               <w:rPr>
                 <w:b/>
               </w:rPr>
-              <w:t>Kho nhiên liệu</w:t>
-            </w:r>
-            <w:r>
-              <w:t xml:space="preserve"> — sổ nhập / xuất cho xe / tồn</w:t>
+              <w:t>Đổi xe</w:t>
+            </w:r>
+            <w:r>
+              <w:t xml:space="preserve"> trên phiếu đang chạy — giữ nguyên chuyến, kéo mục I về kiểm lại</w:t>
             </w:r>
           </w:p>
         </w:tc>
@@ -1501,7 +1561,7 @@
           <w:p>
             <w:r/>
             <w:r>
-              <w:t>Sheet báo cáo số 3 · TK 625/371</w:t>
+              <w:t>Anh Khampla C2.2</w:t>
             </w:r>
           </w:p>
         </w:tc>
@@ -1514,7 +1574,7 @@
           <w:p>
             <w:r/>
             <w:r>
-              <w:t>Kho phụ tùng (chưa có)</w:t>
+              <w:t>Tiền chuyến tài xế (chưa có)</w:t>
             </w:r>
           </w:p>
         </w:tc>
@@ -1528,10 +1588,10 @@
               <w:rPr>
                 <w:b/>
               </w:rPr>
-              <w:t>Kho phụ tùng</w:t>
-            </w:r>
-            <w:r>
-              <w:t xml:space="preserve"> — tồn, tồn tối thiểu, xuất theo xe</w:t>
+              <w:t>Tiền chuyến &amp; tiền nước tài xế</w:t>
+            </w:r>
+            <w:r>
+              <w:t xml:space="preserve"> — gom từ mục IV theo tháng</w:t>
             </w:r>
           </w:p>
         </w:tc>
@@ -1556,7 +1616,7 @@
           <w:p>
             <w:r/>
             <w:r>
-              <w:t>Sheet báo cáo số 4 · TK 614/371</w:t>
+              <w:t>Sheet báo cáo số 5 của họ</w:t>
             </w:r>
           </w:p>
         </w:tc>
@@ -1569,7 +1629,7 @@
           <w:p>
             <w:r/>
             <w:r>
-              <w:t>Phân quyền (hệ cha lo)</w:t>
+              <w:t>Công nợ nhà cung cấp (chưa có)</w:t>
             </w:r>
           </w:p>
         </w:tc>
@@ -1583,10 +1643,10 @@
               <w:rPr>
                 <w:b/>
               </w:rPr>
-              <w:t>Tài khoản &amp; vai</w:t>
-            </w:r>
-            <w:r>
-              <w:t xml:space="preserve"> — 7 vai, mỗi vai được làm một bước trên phiếu</w:t>
+              <w:t>Theo dõi nhà cung cấp</w:t>
+            </w:r>
+            <w:r>
+              <w:t xml:space="preserve"> — phát sinh từ phiếu, đã trả, còn nợ</w:t>
             </w:r>
           </w:p>
         </w:tc>
@@ -1611,7 +1671,7 @@
           <w:p>
             <w:r/>
             <w:r>
-              <w:t>Sheet ໜ້າວຽກ: ai nhập, ai kiểm, ai ghi sổ, ai chi</w:t>
+              <w:t>Sheet báo cáo số 6</w:t>
             </w:r>
           </w:p>
         </w:tc>
@@ -1624,7 +1684,7 @@
           <w:p>
             <w:r/>
             <w:r>
-              <w:t>Trợ lý AI (EPL_TroLy)</w:t>
+              <w:t>Kho nhiên liệu (chưa có)</w:t>
             </w:r>
           </w:p>
         </w:tc>
@@ -1635,7 +1695,13 @@
           <w:p>
             <w:r/>
             <w:r>
-              <w:t>—</w:t>
+              <w:rPr>
+                <w:b/>
+              </w:rPr>
+              <w:t>Kho nhiên liệu</w:t>
+            </w:r>
+            <w:r>
+              <w:t xml:space="preserve"> — sổ nhập / xuất cho xe / tồn</w:t>
             </w:r>
           </w:p>
         </w:tc>
@@ -1649,7 +1715,7 @@
               <w:rPr>
                 <w:b/>
               </w:rPr>
-              <w:t>Không mang sang</w:t>
+              <w:t>Mới</w:t>
             </w:r>
           </w:p>
         </w:tc>
@@ -1660,7 +1726,7 @@
           <w:p>
             <w:r/>
             <w:r>
-              <w:t>Ngoài phạm vi "năm 2016"</w:t>
+              <w:t>Sheet báo cáo số 3 · TK 625/371</w:t>
             </w:r>
           </w:p>
         </w:tc>
@@ -1673,7 +1739,7 @@
           <w:p>
             <w:r/>
             <w:r>
-              <w:t>Trang tài xế (EPL_TaiXe)</w:t>
+              <w:t>Kho phụ tùng (chưa có)</w:t>
             </w:r>
           </w:p>
         </w:tc>
@@ -1684,7 +1750,13 @@
           <w:p>
             <w:r/>
             <w:r>
-              <w:t>—</w:t>
+              <w:rPr>
+                <w:b/>
+              </w:rPr>
+              <w:t>Kho phụ tùng</w:t>
+            </w:r>
+            <w:r>
+              <w:t xml:space="preserve"> — tồn, tồn tối thiểu, xuất theo xe</w:t>
             </w:r>
           </w:p>
         </w:tc>
@@ -1698,7 +1770,7 @@
               <w:rPr>
                 <w:b/>
               </w:rPr>
-              <w:t>Không mang sang</w:t>
+              <w:t>Mới</w:t>
             </w:r>
           </w:p>
         </w:tc>
@@ -1709,6 +1781,168 @@
           <w:p>
             <w:r/>
             <w:r>
+              <w:t>Sheet báo cáo số 4 · TK 614/371</w:t>
+            </w:r>
+          </w:p>
+        </w:tc>
+      </w:tr>
+      <w:tr>
+        <w:tc>
+          <w:tcPr>
+            <w:tcW w:type="dxa" w:w="2160"/>
+          </w:tcPr>
+          <w:p>
+            <w:r/>
+            <w:r>
+              <w:t>Phân quyền (hệ cha lo)</w:t>
+            </w:r>
+          </w:p>
+        </w:tc>
+        <w:tc>
+          <w:tcPr>
+            <w:tcW w:type="dxa" w:w="2160"/>
+          </w:tcPr>
+          <w:p>
+            <w:r/>
+            <w:r>
+              <w:rPr>
+                <w:b/>
+              </w:rPr>
+              <w:t>Tài khoản &amp; vai</w:t>
+            </w:r>
+            <w:r>
+              <w:t xml:space="preserve"> — 11 vai, mỗi vai được làm một bước trên phiếu; </w:t>
+            </w:r>
+            <w:r>
+              <w:rPr>
+                <w:b/>
+              </w:rPr>
+              <w:t>máy chủ bỏ hẳn tiền bán</w:t>
+            </w:r>
+            <w:r>
+              <w:t xml:space="preserve"> khỏi gói trả về với vai không được xem</w:t>
+            </w:r>
+          </w:p>
+        </w:tc>
+        <w:tc>
+          <w:tcPr>
+            <w:tcW w:type="dxa" w:w="2160"/>
+          </w:tcPr>
+          <w:p>
+            <w:r/>
+            <w:r>
+              <w:rPr>
+                <w:b/>
+              </w:rPr>
+              <w:t>Mới</w:t>
+            </w:r>
+          </w:p>
+        </w:tc>
+        <w:tc>
+          <w:tcPr>
+            <w:tcW w:type="dxa" w:w="2160"/>
+          </w:tcPr>
+          <w:p>
+            <w:r/>
+            <w:r>
+              <w:t>Sheet ໜ້າວຽກ: ai nhập, ai kiểm, ai ghi sổ, ai chi; anh Khampla C1.2 tách thêm kho phụ tùng và tổ sửa chữa</w:t>
+            </w:r>
+          </w:p>
+        </w:tc>
+      </w:tr>
+      <w:tr>
+        <w:tc>
+          <w:tcPr>
+            <w:tcW w:type="dxa" w:w="2160"/>
+          </w:tcPr>
+          <w:p>
+            <w:r/>
+            <w:r>
+              <w:t>Trợ lý AI (EPL_TroLy)</w:t>
+            </w:r>
+          </w:p>
+        </w:tc>
+        <w:tc>
+          <w:tcPr>
+            <w:tcW w:type="dxa" w:w="2160"/>
+          </w:tcPr>
+          <w:p>
+            <w:r/>
+            <w:r>
+              <w:t>—</w:t>
+            </w:r>
+          </w:p>
+        </w:tc>
+        <w:tc>
+          <w:tcPr>
+            <w:tcW w:type="dxa" w:w="2160"/>
+          </w:tcPr>
+          <w:p>
+            <w:r/>
+            <w:r>
+              <w:rPr>
+                <w:b/>
+              </w:rPr>
+              <w:t>Không mang sang</w:t>
+            </w:r>
+          </w:p>
+        </w:tc>
+        <w:tc>
+          <w:tcPr>
+            <w:tcW w:type="dxa" w:w="2160"/>
+          </w:tcPr>
+          <w:p>
+            <w:r/>
+            <w:r>
+              <w:t>Ngoài phạm vi "năm 2016"</w:t>
+            </w:r>
+          </w:p>
+        </w:tc>
+      </w:tr>
+      <w:tr>
+        <w:tc>
+          <w:tcPr>
+            <w:tcW w:type="dxa" w:w="2160"/>
+          </w:tcPr>
+          <w:p>
+            <w:r/>
+            <w:r>
+              <w:t>Trang tài xế (EPL_TaiXe)</w:t>
+            </w:r>
+          </w:p>
+        </w:tc>
+        <w:tc>
+          <w:tcPr>
+            <w:tcW w:type="dxa" w:w="2160"/>
+          </w:tcPr>
+          <w:p>
+            <w:r/>
+            <w:r>
+              <w:t>—</w:t>
+            </w:r>
+          </w:p>
+        </w:tc>
+        <w:tc>
+          <w:tcPr>
+            <w:tcW w:type="dxa" w:w="2160"/>
+          </w:tcPr>
+          <w:p>
+            <w:r/>
+            <w:r>
+              <w:rPr>
+                <w:b/>
+              </w:rPr>
+              <w:t>Không mang sang</w:t>
+            </w:r>
+          </w:p>
+        </w:tc>
+        <w:tc>
+          <w:tcPr>
+            <w:tcW w:type="dxa" w:w="2160"/>
+          </w:tcPr>
+          <w:p>
+            <w:r/>
+            <w:r>
               <w:t>Tài xế không thao tác trên hệ</w:t>
             </w:r>
           </w:p>
@@ -1724,7 +1958,7 @@
         <w:rPr>
           <w:color w:val="145C4A"/>
         </w:rPr>
-        <w:t>3. Chín vai và việc của từng vai</w:t>
+        <w:t>3. Mười một vai và việc của từng vai</w:t>
       </w:r>
     </w:p>
     <w:tbl>
@@ -1834,7 +2068,16 @@
               <w:t>Nhập</w:t>
             </w:r>
             <w:r>
-              <w:t xml:space="preserve"> mục I–VI, lập phiếu, cập nhật xe đã chạy / đã tới</w:t>
+              <w:t xml:space="preserve"> mục I–IV và VI, lập phiếu, cập nhật xe đã chạy / đã tới, </w:t>
+            </w:r>
+            <w:r>
+              <w:rPr>
+                <w:b/>
+              </w:rPr>
+              <w:t>đổi xe</w:t>
+            </w:r>
+            <w:r>
+              <w:t xml:space="preserve"> giữa đường. Mục V và kho phụ tùng đã rút sang hai vai dưới (C1.2)</w:t>
             </w:r>
           </w:p>
         </w:tc>
@@ -1862,7 +2105,7 @@
           <w:p>
             <w:r/>
             <w:r>
-              <w:t>ບັນຊີລາຍຈ່າຍ/ຮັບ ວຽງຈັນ — Kế toán thu/chi Viêng Chăn</w:t>
+              <w:t>ບັນຊີລາຍຈ່າຍ/ຮັບ ວຽງຈັນ — KT Thu/Chi Viêng Chăn</w:t>
             </w:r>
           </w:p>
         </w:tc>
@@ -1879,16 +2122,7 @@
               <w:t>Kiểm</w:t>
             </w:r>
             <w:r>
-              <w:t xml:space="preserve"> I, II, IV, V, VI · </w:t>
-            </w:r>
-            <w:r>
-              <w:rPr>
-                <w:b/>
-              </w:rPr>
-              <w:t>ghi sổ</w:t>
-            </w:r>
-            <w:r>
-              <w:t xml:space="preserve"> IV, V, VI · trả lại cho Bãi sửa</w:t>
+              <w:t xml:space="preserve"> I, II · khoá phiếu · bảng giá khách · danh mục chủ xe · thẻ cao tốc · tỷ giá</w:t>
             </w:r>
           </w:p>
         </w:tc>
@@ -1905,7 +2139,7 @@
                 <w:rFonts w:ascii="Consolas" w:hAnsi="Consolas"/>
                 <w:sz w:val="19"/>
               </w:rPr>
-              <w:t>fuel</w:t>
+              <w:t>expacct</w:t>
             </w:r>
           </w:p>
         </w:tc>
@@ -1916,7 +2150,7 @@
           <w:p>
             <w:r/>
             <w:r>
-              <w:t>ບັນຊີສາງນໍ້າມັນ — Kế toán kho nhiên liệu</w:t>
+              <w:t>ບັນຊີລາຍຈ່າຍ ວຽງຈັນ — KT Chi phí VC</w:t>
             </w:r>
           </w:p>
         </w:tc>
@@ -1942,7 +2176,7 @@
               <w:t>ghi sổ</w:t>
             </w:r>
             <w:r>
-              <w:t xml:space="preserve"> mục III</w:t>
+              <w:t xml:space="preserve"> IV, V, VI · lệnh sửa chữa · nhà cung cấp · tất toán tài xế</w:t>
             </w:r>
           </w:p>
         </w:tc>
@@ -1959,7 +2193,7 @@
                 <w:rFonts w:ascii="Consolas" w:hAnsi="Consolas"/>
                 <w:sz w:val="19"/>
               </w:rPr>
-              <w:t>treasury</w:t>
+              <w:t>parts</w:t>
             </w:r>
           </w:p>
         </w:tc>
@@ -1970,7 +2204,7 @@
           <w:p>
             <w:r/>
             <w:r>
-              <w:t>ຄັງເງິນ ວຽງຈັນ — Quỹ Viêng Chăn</w:t>
+              <w:t>ຜູ້ຮັກສາສາງອະໄຫຼ່ ທ່າບົກ — Thủ kho phụ tùng</w:t>
             </w:r>
           </w:p>
         </w:tc>
@@ -1984,10 +2218,10 @@
               <w:rPr>
                 <w:b/>
               </w:rPr>
-              <w:t>Chi</w:t>
-            </w:r>
-            <w:r>
-              <w:t xml:space="preserve"> mục III</w:t>
+              <w:t>Nhập · xuất kho phụ tùng</w:t>
+            </w:r>
+            <w:r>
+              <w:t>; không duyệt mục nào</w:t>
             </w:r>
           </w:p>
         </w:tc>
@@ -2004,7 +2238,7 @@
                 <w:rFonts w:ascii="Consolas" w:hAnsi="Consolas"/>
                 <w:sz w:val="19"/>
               </w:rPr>
-              <w:t>cash</w:t>
+              <w:t>repair</w:t>
             </w:r>
           </w:p>
         </w:tc>
@@ -2015,7 +2249,7 @@
           <w:p>
             <w:r/>
             <w:r>
-              <w:t>ຄັງເງິນສົດຍ່ອຍ ທ່າບົກ — Tiền mặt lẻ Thà Bốc</w:t>
+              <w:t>ໜ່ວຍສ້ອມແປງ ທ່າບົກ — Tổ sửa chữa</w:t>
             </w:r>
           </w:p>
         </w:tc>
@@ -2029,10 +2263,16 @@
               <w:rPr>
                 <w:b/>
               </w:rPr>
-              <w:t>Chi</w:t>
-            </w:r>
-            <w:r>
-              <w:t xml:space="preserve"> mục IV, V, VI</w:t>
+              <w:t>Nhập mục V</w:t>
+            </w:r>
+            <w:r>
+              <w:t xml:space="preserve">, duyệt báo hỏng của tài xế, quyết lấy kho hay ra gara, lập </w:t>
+            </w:r>
+            <w:r>
+              <w:rPr>
+                <w:b/>
+              </w:rPr>
+              <w:t>lệnh sửa chữa riêng</w:t>
             </w:r>
           </w:p>
         </w:tc>
@@ -2049,7 +2289,7 @@
                 <w:rFonts w:ascii="Consolas" w:hAnsi="Consolas"/>
                 <w:sz w:val="19"/>
               </w:rPr>
-              <w:t>rev</w:t>
+              <w:t>fuel</w:t>
             </w:r>
           </w:p>
         </w:tc>
@@ -2060,7 +2300,7 @@
           <w:p>
             <w:r/>
             <w:r>
-              <w:t>ບັນຊີລາຍຮັບ — Kế toán doanh thu</w:t>
+              <w:t>ບັນຊີສາງນໍ້າມັນ — Kế toán kho nhiên liệu</w:t>
             </w:r>
           </w:p>
         </w:tc>
@@ -2074,10 +2314,163 @@
               <w:rPr>
                 <w:b/>
               </w:rPr>
+              <w:t>Kiểm</w:t>
+            </w:r>
+            <w:r>
+              <w:t xml:space="preserve"> và </w:t>
+            </w:r>
+            <w:r>
+              <w:rPr>
+                <w:b/>
+              </w:rPr>
+              <w:t>ghi sổ</w:t>
+            </w:r>
+            <w:r>
+              <w:t xml:space="preserve"> mục III</w:t>
+            </w:r>
+          </w:p>
+        </w:tc>
+      </w:tr>
+      <w:tr>
+        <w:tc>
+          <w:tcPr>
+            <w:tcW w:type="dxa" w:w="2880"/>
+          </w:tcPr>
+          <w:p>
+            <w:r/>
+            <w:r>
+              <w:rPr>
+                <w:rFonts w:ascii="Consolas" w:hAnsi="Consolas"/>
+                <w:sz w:val="19"/>
+              </w:rPr>
+              <w:t>treasury</w:t>
+            </w:r>
+          </w:p>
+        </w:tc>
+        <w:tc>
+          <w:tcPr>
+            <w:tcW w:type="dxa" w:w="2880"/>
+          </w:tcPr>
+          <w:p>
+            <w:r/>
+            <w:r>
+              <w:t>ຄັງເງິນ ວຽງຈັນ — Quỹ Viêng Chăn</w:t>
+            </w:r>
+          </w:p>
+        </w:tc>
+        <w:tc>
+          <w:tcPr>
+            <w:tcW w:type="dxa" w:w="2880"/>
+          </w:tcPr>
+          <w:p>
+            <w:r/>
+            <w:r>
+              <w:rPr>
+                <w:b/>
+              </w:rPr>
+              <w:t>Chi</w:t>
+            </w:r>
+            <w:r>
+              <w:t xml:space="preserve"> mục III</w:t>
+            </w:r>
+          </w:p>
+        </w:tc>
+      </w:tr>
+      <w:tr>
+        <w:tc>
+          <w:tcPr>
+            <w:tcW w:type="dxa" w:w="2880"/>
+          </w:tcPr>
+          <w:p>
+            <w:r/>
+            <w:r>
+              <w:rPr>
+                <w:rFonts w:ascii="Consolas" w:hAnsi="Consolas"/>
+                <w:sz w:val="19"/>
+              </w:rPr>
+              <w:t>cash</w:t>
+            </w:r>
+          </w:p>
+        </w:tc>
+        <w:tc>
+          <w:tcPr>
+            <w:tcW w:type="dxa" w:w="2880"/>
+          </w:tcPr>
+          <w:p>
+            <w:r/>
+            <w:r>
+              <w:t>ຄັງເງິນສົດຍ່ອຍ ທ່າບົກ — Tiền mặt lẻ Thà Bốc</w:t>
+            </w:r>
+          </w:p>
+        </w:tc>
+        <w:tc>
+          <w:tcPr>
+            <w:tcW w:type="dxa" w:w="2880"/>
+          </w:tcPr>
+          <w:p>
+            <w:r/>
+            <w:r>
+              <w:rPr>
+                <w:b/>
+              </w:rPr>
+              <w:t>Chi</w:t>
+            </w:r>
+            <w:r>
+              <w:t xml:space="preserve"> mục IV, V, VI</w:t>
+            </w:r>
+          </w:p>
+        </w:tc>
+      </w:tr>
+      <w:tr>
+        <w:tc>
+          <w:tcPr>
+            <w:tcW w:type="dxa" w:w="2880"/>
+          </w:tcPr>
+          <w:p>
+            <w:r/>
+            <w:r>
+              <w:rPr>
+                <w:rFonts w:ascii="Consolas" w:hAnsi="Consolas"/>
+                <w:sz w:val="19"/>
+              </w:rPr>
+              <w:t>rev</w:t>
+            </w:r>
+          </w:p>
+        </w:tc>
+        <w:tc>
+          <w:tcPr>
+            <w:tcW w:type="dxa" w:w="2880"/>
+          </w:tcPr>
+          <w:p>
+            <w:r/>
+            <w:r>
+              <w:t>ບັນຊີລາຍຮັບ — Kế toán doanh thu</w:t>
+            </w:r>
+          </w:p>
+        </w:tc>
+        <w:tc>
+          <w:tcPr>
+            <w:tcW w:type="dxa" w:w="2880"/>
+          </w:tcPr>
+          <w:p>
+            <w:r/>
+            <w:r>
+              <w:rPr>
+                <w:b/>
+              </w:rPr>
               <w:t>Lập hoá đơn</w:t>
             </w:r>
             <w:r>
-              <w:t xml:space="preserve">, </w:t>
+              <w:t xml:space="preserve"> (từng phiếu hoặc </w:t>
+            </w:r>
+            <w:r>
+              <w:rPr>
+                <w:b/>
+              </w:rPr>
+              <w:t>gộp tháng</w:t>
+            </w:r>
+            <w:r>
+              <w:t xml:space="preserve">), </w:t>
             </w:r>
             <w:r>
               <w:rPr>
@@ -2086,7 +2479,7 @@
               <w:t>ghi thu tiền</w:t>
             </w:r>
             <w:r>
-              <w:t xml:space="preserve"> khách (mức phiếu)</w:t>
+              <w:t xml:space="preserve"> khách, xem cấn trừ cuối tháng</w:t>
             </w:r>
           </w:p>
         </w:tc>
@@ -2790,16 +3183,19 @@
           <w:p>
             <w:r/>
             <w:r>
-              <w:t xml:space="preserve">Trừ tồn kho phụ tùng </w:t>
+              <w:rPr>
+                <w:b/>
+              </w:rPr>
+              <w:t>Tổ sửa chữa</w:t>
+            </w:r>
+            <w:r>
+              <w:t xml:space="preserve"> khai (màn Theo dõi tuyến hoặc lệnh sửa chữa) → trừ tồn kho phụ tùng </w:t>
             </w:r>
             <w:r>
               <w:rPr>
                 <w:b/>
               </w:rPr>
               <w:t>ngay lúc khai</w:t>
-            </w:r>
-            <w:r>
-              <w:t xml:space="preserve"> trên màn Theo dõi tuyến</w:t>
             </w:r>
           </w:p>
         </w:tc>
@@ -2814,7 +3210,7 @@
                 <w:rFonts w:ascii="Consolas" w:hAnsi="Consolas"/>
                 <w:sz w:val="19"/>
               </w:rPr>
-              <w:t>614/371</w:t>
+              <w:t>614/1371</w:t>
             </w:r>
           </w:p>
         </w:tc>
@@ -2829,7 +3225,7 @@
                 <w:rFonts w:ascii="Consolas" w:hAnsi="Consolas"/>
                 <w:sz w:val="19"/>
               </w:rPr>
-              <w:t>4022/371</w:t>
+              <w:t>4022/1371</w:t>
             </w:r>
           </w:p>
         </w:tc>

</xml_diff>